<commit_message>
TS 2.1-2.6 Kramam final loaded
</commit_message>
<xml_diff>
--- a/TS-Kramam/TS-2.1/TS 2.1 Tamil Krama Paatam Corrections.docx
+++ b/TS-Kramam/TS-2.1/TS 2.1 Tamil Krama Paatam Corrections.docx
@@ -1,6 +1,6 @@
 
 <file path=word/document.xml><?xml version="1.0" encoding="utf-8"?>
-<w:document xmlns:wpc="http://schemas.microsoft.com/office/word/2010/wordprocessingCanvas" xmlns:cx="http://schemas.microsoft.com/office/drawing/2014/chartex" xmlns:cx1="http://schemas.microsoft.com/office/drawing/2015/9/8/chartex" xmlns:cx2="http://schemas.microsoft.com/office/drawing/2015/10/21/chartex" xmlns:cx3="http://schemas.microsoft.com/office/drawing/2016/5/9/chartex" xmlns:cx4="http://schemas.microsoft.com/office/drawing/2016/5/10/chartex" xmlns:cx5="http://schemas.microsoft.com/office/drawing/2016/5/11/chartex" xmlns:cx6="http://schemas.microsoft.com/office/drawing/2016/5/12/chartex" xmlns:cx7="http://schemas.microsoft.com/office/drawing/2016/5/13/chartex" xmlns:cx8="http://schemas.microsoft.com/office/drawing/2016/5/14/chartex" xmlns:mc="http://schemas.openxmlformats.org/markup-compatibility/2006" xmlns:aink="http://schemas.microsoft.com/office/drawing/2016/ink" xmlns:am3d="http://schemas.microsoft.com/office/drawing/2017/model3d" xmlns:o="urn:schemas-microsoft-com:office:office" xmlns:oel="http://schemas.microsoft.com/office/2019/extlst" xmlns:r="http://schemas.openxmlformats.org/officeDocument/2006/relationships" xmlns:m="http://schemas.openxmlformats.org/officeDocument/2006/math" xmlns:v="urn:schemas-microsoft-com:vml" xmlns:wp14="http://schemas.microsoft.com/office/word/2010/wordprocessingDrawing" xmlns:wp="http://schemas.openxmlformats.org/drawingml/2006/wordprocessingDrawing" xmlns:w10="urn:schemas-microsoft-com:office:word" xmlns:w="http://schemas.openxmlformats.org/wordprocessingml/2006/main" xmlns:w14="http://schemas.microsoft.com/office/word/2010/wordml" xmlns:w15="http://schemas.microsoft.com/office/word/2012/wordml" xmlns:w16cex="http://schemas.microsoft.com/office/word/2018/wordml/cex" xmlns:w16cid="http://schemas.microsoft.com/office/word/2016/wordml/cid" xmlns:w16="http://schemas.microsoft.com/office/word/2018/wordml" xmlns:w16du="http://schemas.microsoft.com/office/word/2023/wordml/word16du" xmlns:w16sdtdh="http://schemas.microsoft.com/office/word/2020/wordml/sdtdatahash" xmlns:w16sdtfl="http://schemas.microsoft.com/office/word/2024/wordml/sdtformatlock" xmlns:w16se="http://schemas.microsoft.com/office/word/2015/wordml/symex" xmlns:wpg="http://schemas.microsoft.com/office/word/2010/wordprocessingGroup" xmlns:wpi="http://schemas.microsoft.com/office/word/2010/wordprocessingInk" xmlns:wne="http://schemas.microsoft.com/office/word/2006/wordml" xmlns:wps="http://schemas.microsoft.com/office/word/2010/wordprocessingShape" mc:Ignorable="w14 w15 w16se w16cid w16 w16cex w16sdtdh w16sdtfl w16du wp14">
+<w:document xmlns:wpc="http://schemas.microsoft.com/office/word/2010/wordprocessingCanvas" xmlns:cx="http://schemas.microsoft.com/office/drawing/2014/chartex" xmlns:cx1="http://schemas.microsoft.com/office/drawing/2015/9/8/chartex" xmlns:cx2="http://schemas.microsoft.com/office/drawing/2015/10/21/chartex" xmlns:cx3="http://schemas.microsoft.com/office/drawing/2016/5/9/chartex" xmlns:cx4="http://schemas.microsoft.com/office/drawing/2016/5/10/chartex" xmlns:cx5="http://schemas.microsoft.com/office/drawing/2016/5/11/chartex" xmlns:cx6="http://schemas.microsoft.com/office/drawing/2016/5/12/chartex" xmlns:cx7="http://schemas.microsoft.com/office/drawing/2016/5/13/chartex" xmlns:cx8="http://schemas.microsoft.com/office/drawing/2016/5/14/chartex" xmlns:mc="http://schemas.openxmlformats.org/markup-compatibility/2006" xmlns:aink="http://schemas.microsoft.com/office/drawing/2016/ink" xmlns:am3d="http://schemas.microsoft.com/office/drawing/2017/model3d" xmlns:o="urn:schemas-microsoft-com:office:office" xmlns:oel="http://schemas.microsoft.com/office/2019/extlst" xmlns:r="http://schemas.openxmlformats.org/officeDocument/2006/relationships" xmlns:m="http://schemas.openxmlformats.org/officeDocument/2006/math" xmlns:v="urn:schemas-microsoft-com:vml" xmlns:wp14="http://schemas.microsoft.com/office/word/2010/wordprocessingDrawing" xmlns:wp="http://schemas.openxmlformats.org/drawingml/2006/wordprocessingDrawing" xmlns:w10="urn:schemas-microsoft-com:office:word" xmlns:w="http://schemas.openxmlformats.org/wordprocessingml/2006/main" xmlns:w14="http://schemas.microsoft.com/office/word/2010/wordml" xmlns:w15="http://schemas.microsoft.com/office/word/2012/wordml" xmlns:w16cei="http://schemas.microsoft.com/office/word/2026/wordml/cei" xmlns:w16cex="http://schemas.microsoft.com/office/word/2018/wordml/cex" xmlns:w16cid="http://schemas.microsoft.com/office/word/2016/wordml/cid" xmlns:w16="http://schemas.microsoft.com/office/word/2018/wordml" xmlns:w16du="http://schemas.microsoft.com/office/word/2023/wordml/word16du" xmlns:w16sdtdh="http://schemas.microsoft.com/office/word/2020/wordml/sdtdatahash" xmlns:w16sdtfl="http://schemas.microsoft.com/office/word/2024/wordml/sdtformatlock" xmlns:w16se="http://schemas.microsoft.com/office/word/2015/wordml/symex" xmlns:wpg="http://schemas.microsoft.com/office/word/2010/wordprocessingGroup" xmlns:wpi="http://schemas.microsoft.com/office/word/2010/wordprocessingInk" xmlns:wne="http://schemas.microsoft.com/office/word/2006/wordml" xmlns:wps="http://schemas.microsoft.com/office/word/2010/wordprocessingShape" mc:Ignorable="w14 w15 w16se w16cid w16 w16cex w16sdtdh w16sdtfl w16du wp14">
   <w:body>
     <w:p>
       <w:pPr>
@@ -101,9 +101,8 @@
           <w:szCs w:val="32"/>
           <w:u w:val="single"/>
         </w:rPr>
-        <w:t xml:space="preserve">Observed </w:t>
+        <w:t xml:space="preserve">Observed till </w:t>
       </w:r>
-      <w:proofErr w:type="gramStart"/>
       <w:r>
         <w:rPr>
           <w:b/>
@@ -112,20 +111,8 @@
           <w:szCs w:val="32"/>
           <w:u w:val="single"/>
         </w:rPr>
-        <w:t xml:space="preserve">till </w:t>
+        <w:t>31st July 2026</w:t>
       </w:r>
-      <w:r>
-        <w:rPr>
-          <w:b/>
-          <w:bCs/>
-          <w:sz w:val="32"/>
-          <w:szCs w:val="32"/>
-          <w:highlight w:val="red"/>
-          <w:u w:val="single"/>
-        </w:rPr>
-        <w:t>????</w:t>
-      </w:r>
-      <w:proofErr w:type="gramEnd"/>
     </w:p>
     <w:p>
       <w:pPr>
@@ -3054,7 +3041,7 @@
       </w:tr>
       <w:tr>
         <w:trPr>
-          <w:trHeight w:val="1946"/>
+          <w:trHeight w:val="1125"/>
         </w:trPr>
         <w:tc>
           <w:tcPr>
@@ -3719,6 +3706,7 @@
               </w:rPr>
               <w:t>(</w:t>
             </w:r>
+            <w:proofErr w:type="spellStart"/>
             <w:r>
               <w:rPr>
                 <w:rFonts w:cs="Arial"/>
@@ -3726,7 +3714,37 @@
                 <w:szCs w:val="28"/>
                 <w:lang w:val="en-IN" w:bidi="ta-IN"/>
               </w:rPr>
-              <w:t>its hrasvam)</w:t>
+              <w:t>its</w:t>
+            </w:r>
+            <w:proofErr w:type="spellEnd"/>
+            <w:r>
+              <w:rPr>
+                <w:rFonts w:cs="Arial"/>
+                <w:sz w:val="28"/>
+                <w:szCs w:val="28"/>
+                <w:lang w:val="en-IN" w:bidi="ta-IN"/>
+              </w:rPr>
+              <w:t xml:space="preserve"> </w:t>
+            </w:r>
+            <w:proofErr w:type="spellStart"/>
+            <w:r>
+              <w:rPr>
+                <w:rFonts w:cs="Arial"/>
+                <w:sz w:val="28"/>
+                <w:szCs w:val="28"/>
+                <w:lang w:val="en-IN" w:bidi="ta-IN"/>
+              </w:rPr>
+              <w:t>hrasvam</w:t>
+            </w:r>
+            <w:proofErr w:type="spellEnd"/>
+            <w:r>
+              <w:rPr>
+                <w:rFonts w:cs="Arial"/>
+                <w:sz w:val="28"/>
+                <w:szCs w:val="28"/>
+                <w:lang w:val="en-IN" w:bidi="ta-IN"/>
+              </w:rPr>
+              <w:t>)</w:t>
             </w:r>
           </w:p>
         </w:tc>
@@ -5019,6 +5037,18 @@
         </w:tc>
       </w:tr>
     </w:tbl>
+    <w:p>
+      <w:pPr>
+        <w:jc w:val="center"/>
+        <w:rPr>
+          <w:b/>
+          <w:bCs/>
+          <w:sz w:val="32"/>
+          <w:szCs w:val="32"/>
+          <w:u w:val="single"/>
+        </w:rPr>
+      </w:pPr>
+    </w:p>
     <w:p>
       <w:pPr>
         <w:jc w:val="center"/>
@@ -6136,7 +6166,6 @@
                 <w:szCs w:val="28"/>
                 <w:lang w:val="it-IT"/>
               </w:rPr>
-              <w:lastRenderedPageBreak/>
               <w:t>TS 2.1.9.4 - Kramam</w:t>
             </w:r>
           </w:p>
@@ -6358,6 +6387,7 @@
                 <w:cs/>
                 <w:lang w:bidi="ta-IN"/>
               </w:rPr>
+              <w:lastRenderedPageBreak/>
               <w:t>ஆ</w:t>
             </w:r>
             <w:r>
@@ -6494,6 +6524,7 @@
                 <w:cs/>
                 <w:lang w:bidi="ta-IN"/>
               </w:rPr>
+              <w:lastRenderedPageBreak/>
               <w:t>ஸ ஏ</w:t>
             </w:r>
             <w:r>
@@ -6623,7 +6654,18 @@
                 <w:cs/>
                 <w:lang w:bidi="ta-IN"/>
               </w:rPr>
-              <w:t xml:space="preserve"> ஆ</w:t>
+              <w:t xml:space="preserve"> </w:t>
+            </w:r>
+            <w:r>
+              <w:rPr>
+                <w:rFonts w:ascii="Latha" w:hAnsi="Latha" w:cs="Latha"/>
+                <w:sz w:val="28"/>
+                <w:szCs w:val="28"/>
+                <w:cs/>
+                <w:lang w:bidi="ta-IN"/>
+              </w:rPr>
+              <w:lastRenderedPageBreak/>
+              <w:t>ஆ</w:t>
             </w:r>
             <w:r>
               <w:rPr>
@@ -6765,6 +6807,7 @@
                 <w:szCs w:val="28"/>
                 <w:lang w:val="it-IT"/>
               </w:rPr>
+              <w:lastRenderedPageBreak/>
               <w:t>TS 2.1.11.2 - Kramam</w:t>
             </w:r>
           </w:p>
@@ -7374,54 +7417,6 @@
         </w:tc>
       </w:tr>
     </w:tbl>
-    <w:p>
-      <w:pPr>
-        <w:jc w:val="center"/>
-        <w:rPr>
-          <w:b/>
-          <w:bCs/>
-          <w:sz w:val="32"/>
-          <w:szCs w:val="32"/>
-          <w:u w:val="single"/>
-        </w:rPr>
-      </w:pPr>
-    </w:p>
-    <w:p>
-      <w:pPr>
-        <w:jc w:val="center"/>
-        <w:rPr>
-          <w:b/>
-          <w:bCs/>
-          <w:sz w:val="32"/>
-          <w:szCs w:val="32"/>
-          <w:u w:val="single"/>
-        </w:rPr>
-      </w:pPr>
-    </w:p>
-    <w:p>
-      <w:pPr>
-        <w:jc w:val="center"/>
-        <w:rPr>
-          <w:b/>
-          <w:bCs/>
-          <w:sz w:val="32"/>
-          <w:szCs w:val="32"/>
-          <w:u w:val="single"/>
-        </w:rPr>
-      </w:pPr>
-    </w:p>
-    <w:p>
-      <w:pPr>
-        <w:jc w:val="center"/>
-        <w:rPr>
-          <w:b/>
-          <w:bCs/>
-          <w:sz w:val="32"/>
-          <w:szCs w:val="32"/>
-          <w:u w:val="single"/>
-        </w:rPr>
-      </w:pPr>
-    </w:p>
     <w:p>
       <w:pPr>
         <w:jc w:val="center"/>
@@ -7714,7 +7709,6 @@
                 <w:szCs w:val="28"/>
                 <w:lang w:val="it-IT"/>
               </w:rPr>
-              <w:lastRenderedPageBreak/>
               <w:t>TS 2.1.8.1 - Kramam</w:t>
             </w:r>
           </w:p>
@@ -9466,78 +9460,6 @@
         </w:tc>
       </w:tr>
     </w:tbl>
-    <w:p>
-      <w:pPr>
-        <w:jc w:val="center"/>
-        <w:rPr>
-          <w:b/>
-          <w:bCs/>
-          <w:sz w:val="32"/>
-          <w:szCs w:val="32"/>
-          <w:u w:val="single"/>
-        </w:rPr>
-      </w:pPr>
-    </w:p>
-    <w:p>
-      <w:pPr>
-        <w:jc w:val="center"/>
-        <w:rPr>
-          <w:b/>
-          <w:bCs/>
-          <w:sz w:val="32"/>
-          <w:szCs w:val="32"/>
-          <w:u w:val="single"/>
-        </w:rPr>
-      </w:pPr>
-    </w:p>
-    <w:p>
-      <w:pPr>
-        <w:jc w:val="center"/>
-        <w:rPr>
-          <w:b/>
-          <w:bCs/>
-          <w:sz w:val="32"/>
-          <w:szCs w:val="32"/>
-          <w:u w:val="single"/>
-        </w:rPr>
-      </w:pPr>
-    </w:p>
-    <w:p>
-      <w:pPr>
-        <w:jc w:val="center"/>
-        <w:rPr>
-          <w:b/>
-          <w:bCs/>
-          <w:sz w:val="32"/>
-          <w:szCs w:val="32"/>
-          <w:u w:val="single"/>
-        </w:rPr>
-      </w:pPr>
-    </w:p>
-    <w:p>
-      <w:pPr>
-        <w:jc w:val="center"/>
-        <w:rPr>
-          <w:b/>
-          <w:bCs/>
-          <w:sz w:val="32"/>
-          <w:szCs w:val="32"/>
-          <w:u w:val="single"/>
-        </w:rPr>
-      </w:pPr>
-    </w:p>
-    <w:p>
-      <w:pPr>
-        <w:jc w:val="center"/>
-        <w:rPr>
-          <w:b/>
-          <w:bCs/>
-          <w:sz w:val="32"/>
-          <w:szCs w:val="32"/>
-          <w:u w:val="single"/>
-        </w:rPr>
-      </w:pPr>
-    </w:p>
     <w:p>
       <w:pPr>
         <w:jc w:val="center"/>
@@ -9569,6 +9491,7 @@
           <w:szCs w:val="32"/>
           <w:u w:val="single"/>
         </w:rPr>
+        <w:lastRenderedPageBreak/>
         <w:t xml:space="preserve">TS </w:t>
       </w:r>
       <w:r>
@@ -9751,7 +9674,6 @@
                 <w:sz w:val="28"/>
                 <w:szCs w:val="28"/>
               </w:rPr>
-              <w:lastRenderedPageBreak/>
               <w:t>Reference</w:t>
             </w:r>
           </w:p>
@@ -9778,7 +9700,6 @@
                 <w:sz w:val="28"/>
                 <w:szCs w:val="28"/>
               </w:rPr>
-              <w:lastRenderedPageBreak/>
               <w:t>As Printed</w:t>
             </w:r>
           </w:p>
@@ -12968,6 +12889,7 @@
                 <w:sz w:val="28"/>
                 <w:szCs w:val="28"/>
               </w:rPr>
+              <w:lastRenderedPageBreak/>
               <w:t xml:space="preserve">TS 2.1.4.4 </w:t>
             </w:r>
             <w:r>
@@ -13537,7 +13459,6 @@
                 <w:sz w:val="28"/>
                 <w:szCs w:val="28"/>
               </w:rPr>
-              <w:lastRenderedPageBreak/>
               <w:t>TS 2.1.4.5</w:t>
             </w:r>
             <w:r>
@@ -13997,7 +13918,23 @@
                 <w:b/>
                 <w:bCs/>
               </w:rPr>
-              <w:t>(it is “sye”)</w:t>
+              <w:t>(it is “</w:t>
+            </w:r>
+            <w:proofErr w:type="spellStart"/>
+            <w:r>
+              <w:rPr>
+                <w:b/>
+                <w:bCs/>
+              </w:rPr>
+              <w:t>sye</w:t>
+            </w:r>
+            <w:proofErr w:type="spellEnd"/>
+            <w:r>
+              <w:rPr>
+                <w:b/>
+                <w:bCs/>
+              </w:rPr>
+              <w:t>”)</w:t>
             </w:r>
           </w:p>
         </w:tc>
@@ -16886,6 +16823,7 @@
                 <w:sz w:val="28"/>
                 <w:szCs w:val="28"/>
               </w:rPr>
+              <w:lastRenderedPageBreak/>
               <w:t>TS 2.1.8.1 - Kramam</w:t>
             </w:r>
           </w:p>
@@ -17181,7 +17119,6 @@
                 <w:sz w:val="28"/>
                 <w:szCs w:val="28"/>
               </w:rPr>
-              <w:lastRenderedPageBreak/>
               <w:t>TS 2.1.8.2</w:t>
             </w:r>
             <w:r>
@@ -17846,7 +17783,16 @@
                 <w:sz w:val="28"/>
                 <w:szCs w:val="28"/>
               </w:rPr>
-              <w:t>(swarabak</w:t>
+              <w:t>(</w:t>
+            </w:r>
+            <w:proofErr w:type="spellStart"/>
+            <w:r>
+              <w:rPr>
+                <w:rFonts w:cs="Arial"/>
+                <w:sz w:val="28"/>
+                <w:szCs w:val="28"/>
+              </w:rPr>
+              <w:t>swarabak</w:t>
             </w:r>
             <w:r>
               <w:rPr>
@@ -17864,6 +17810,7 @@
               </w:rPr>
               <w:t>ti</w:t>
             </w:r>
+            <w:proofErr w:type="spellEnd"/>
             <w:r>
               <w:rPr>
                 <w:rFonts w:ascii="BRH Malayalam Extra" w:hAnsi="BRH Malayalam Extra" w:cs="BRH Malayalam Extra"/>
@@ -18365,7 +18312,25 @@
                 <w:sz w:val="28"/>
                 <w:szCs w:val="28"/>
               </w:rPr>
-              <w:t>(visargam inserted)</w:t>
+              <w:t>(</w:t>
+            </w:r>
+            <w:proofErr w:type="spellStart"/>
+            <w:r>
+              <w:rPr>
+                <w:rFonts w:cs="Arial"/>
+                <w:sz w:val="28"/>
+                <w:szCs w:val="28"/>
+              </w:rPr>
+              <w:t>visargam</w:t>
+            </w:r>
+            <w:proofErr w:type="spellEnd"/>
+            <w:r>
+              <w:rPr>
+                <w:rFonts w:cs="Arial"/>
+                <w:sz w:val="28"/>
+                <w:szCs w:val="28"/>
+              </w:rPr>
+              <w:t xml:space="preserve"> inserted)</w:t>
             </w:r>
           </w:p>
         </w:tc>
@@ -20093,7 +20058,16 @@
                 <w:sz w:val="28"/>
                 <w:szCs w:val="28"/>
               </w:rPr>
-              <w:t>(swarabak</w:t>
+              <w:t>(</w:t>
+            </w:r>
+            <w:proofErr w:type="spellStart"/>
+            <w:r>
+              <w:rPr>
+                <w:rFonts w:cs="Arial"/>
+                <w:sz w:val="28"/>
+                <w:szCs w:val="28"/>
+              </w:rPr>
+              <w:t>swarabak</w:t>
             </w:r>
             <w:r>
               <w:rPr>
@@ -20111,6 +20085,7 @@
               </w:rPr>
               <w:t>ti</w:t>
             </w:r>
+            <w:proofErr w:type="spellEnd"/>
             <w:r>
               <w:rPr>
                 <w:rFonts w:ascii="BRH Malayalam Extra" w:hAnsi="BRH Malayalam Extra" w:cs="BRH Malayalam Extra"/>
@@ -20894,6 +20869,7 @@
           <w:szCs w:val="40"/>
           <w:lang w:val="en-IN" w:eastAsia="en-IN"/>
         </w:rPr>
+        <w:lastRenderedPageBreak/>
         <w:t>"</w:t>
       </w:r>
       <w:r>
@@ -20996,7 +20972,6 @@
           <w:szCs w:val="32"/>
           <w:u w:val="single"/>
         </w:rPr>
-        <w:lastRenderedPageBreak/>
         <w:t>==============</w:t>
       </w:r>
     </w:p>
@@ -21087,10 +21062,59 @@
           <w:bCs/>
           <w:sz w:val="32"/>
           <w:szCs w:val="32"/>
-          <w:highlight w:val="yellow"/>
           <w:u w:val="single"/>
         </w:rPr>
-        <w:t>31st Oct 2019</w:t>
+        <w:t>3</w:t>
+      </w:r>
+      <w:r>
+        <w:rPr>
+          <w:b/>
+          <w:bCs/>
+          <w:sz w:val="32"/>
+          <w:szCs w:val="32"/>
+          <w:u w:val="single"/>
+        </w:rPr>
+        <w:t>0th</w:t>
+      </w:r>
+      <w:r>
+        <w:rPr>
+          <w:b/>
+          <w:bCs/>
+          <w:sz w:val="32"/>
+          <w:szCs w:val="32"/>
+          <w:u w:val="single"/>
+        </w:rPr>
+        <w:t xml:space="preserve"> </w:t>
+      </w:r>
+      <w:r>
+        <w:rPr>
+          <w:b/>
+          <w:bCs/>
+          <w:sz w:val="32"/>
+          <w:szCs w:val="32"/>
+          <w:u w:val="single"/>
+        </w:rPr>
+        <w:t>Jun</w:t>
+      </w:r>
+      <w:r>
+        <w:rPr>
+          <w:b/>
+          <w:bCs/>
+          <w:sz w:val="32"/>
+          <w:szCs w:val="32"/>
+          <w:u w:val="single"/>
+        </w:rPr>
+        <w:t xml:space="preserve"> 201</w:t>
+      </w:r>
+      <w:r>
+        <w:rPr>
+          <w:b/>
+          <w:bCs/>
+          <w:sz w:val="32"/>
+          <w:szCs w:val="32"/>
+          <w:u w:val="single"/>
+        </w:rPr>
+        <w:t>8</w:t>
       </w:r>
     </w:p>
     <w:p>
@@ -22751,7 +22775,7 @@
 </file>
 
 <file path=word/endnotes.xml><?xml version="1.0" encoding="utf-8"?>
-<w:endnotes xmlns:wpc="http://schemas.microsoft.com/office/word/2010/wordprocessingCanvas" xmlns:cx="http://schemas.microsoft.com/office/drawing/2014/chartex" xmlns:cx1="http://schemas.microsoft.com/office/drawing/2015/9/8/chartex" xmlns:cx2="http://schemas.microsoft.com/office/drawing/2015/10/21/chartex" xmlns:cx3="http://schemas.microsoft.com/office/drawing/2016/5/9/chartex" xmlns:cx4="http://schemas.microsoft.com/office/drawing/2016/5/10/chartex" xmlns:cx5="http://schemas.microsoft.com/office/drawing/2016/5/11/chartex" xmlns:cx6="http://schemas.microsoft.com/office/drawing/2016/5/12/chartex" xmlns:cx7="http://schemas.microsoft.com/office/drawing/2016/5/13/chartex" xmlns:cx8="http://schemas.microsoft.com/office/drawing/2016/5/14/chartex" xmlns:mc="http://schemas.openxmlformats.org/markup-compatibility/2006" xmlns:aink="http://schemas.microsoft.com/office/drawing/2016/ink" xmlns:am3d="http://schemas.microsoft.com/office/drawing/2017/model3d" xmlns:o="urn:schemas-microsoft-com:office:office" xmlns:oel="http://schemas.microsoft.com/office/2019/extlst" xmlns:r="http://schemas.openxmlformats.org/officeDocument/2006/relationships" xmlns:m="http://schemas.openxmlformats.org/officeDocument/2006/math" xmlns:v="urn:schemas-microsoft-com:vml" xmlns:wp14="http://schemas.microsoft.com/office/word/2010/wordprocessingDrawing" xmlns:wp="http://schemas.openxmlformats.org/drawingml/2006/wordprocessingDrawing" xmlns:w10="urn:schemas-microsoft-com:office:word" xmlns:w="http://schemas.openxmlformats.org/wordprocessingml/2006/main" xmlns:w14="http://schemas.microsoft.com/office/word/2010/wordml" xmlns:w15="http://schemas.microsoft.com/office/word/2012/wordml" xmlns:w16cex="http://schemas.microsoft.com/office/word/2018/wordml/cex" xmlns:w16cid="http://schemas.microsoft.com/office/word/2016/wordml/cid" xmlns:w16="http://schemas.microsoft.com/office/word/2018/wordml" xmlns:w16du="http://schemas.microsoft.com/office/word/2023/wordml/word16du" xmlns:w16sdtdh="http://schemas.microsoft.com/office/word/2020/wordml/sdtdatahash" xmlns:w16sdtfl="http://schemas.microsoft.com/office/word/2024/wordml/sdtformatlock" xmlns:w16se="http://schemas.microsoft.com/office/word/2015/wordml/symex" xmlns:wpg="http://schemas.microsoft.com/office/word/2010/wordprocessingGroup" xmlns:wpi="http://schemas.microsoft.com/office/word/2010/wordprocessingInk" xmlns:wne="http://schemas.microsoft.com/office/word/2006/wordml" xmlns:wps="http://schemas.microsoft.com/office/word/2010/wordprocessingShape" mc:Ignorable="w14 w15 w16se w16cid w16 w16cex w16sdtdh w16sdtfl w16du wp14">
+<w:endnotes xmlns:wpc="http://schemas.microsoft.com/office/word/2010/wordprocessingCanvas" xmlns:cx="http://schemas.microsoft.com/office/drawing/2014/chartex" xmlns:cx1="http://schemas.microsoft.com/office/drawing/2015/9/8/chartex" xmlns:cx2="http://schemas.microsoft.com/office/drawing/2015/10/21/chartex" xmlns:cx3="http://schemas.microsoft.com/office/drawing/2016/5/9/chartex" xmlns:cx4="http://schemas.microsoft.com/office/drawing/2016/5/10/chartex" xmlns:cx5="http://schemas.microsoft.com/office/drawing/2016/5/11/chartex" xmlns:cx6="http://schemas.microsoft.com/office/drawing/2016/5/12/chartex" xmlns:cx7="http://schemas.microsoft.com/office/drawing/2016/5/13/chartex" xmlns:cx8="http://schemas.microsoft.com/office/drawing/2016/5/14/chartex" xmlns:mc="http://schemas.openxmlformats.org/markup-compatibility/2006" xmlns:aink="http://schemas.microsoft.com/office/drawing/2016/ink" xmlns:am3d="http://schemas.microsoft.com/office/drawing/2017/model3d" xmlns:o="urn:schemas-microsoft-com:office:office" xmlns:oel="http://schemas.microsoft.com/office/2019/extlst" xmlns:r="http://schemas.openxmlformats.org/officeDocument/2006/relationships" xmlns:m="http://schemas.openxmlformats.org/officeDocument/2006/math" xmlns:v="urn:schemas-microsoft-com:vml" xmlns:wp14="http://schemas.microsoft.com/office/word/2010/wordprocessingDrawing" xmlns:wp="http://schemas.openxmlformats.org/drawingml/2006/wordprocessingDrawing" xmlns:w10="urn:schemas-microsoft-com:office:word" xmlns:w="http://schemas.openxmlformats.org/wordprocessingml/2006/main" xmlns:w14="http://schemas.microsoft.com/office/word/2010/wordml" xmlns:w15="http://schemas.microsoft.com/office/word/2012/wordml" xmlns:w16cei="http://schemas.microsoft.com/office/word/2026/wordml/cei" xmlns:w16cex="http://schemas.microsoft.com/office/word/2018/wordml/cex" xmlns:w16cid="http://schemas.microsoft.com/office/word/2016/wordml/cid" xmlns:w16="http://schemas.microsoft.com/office/word/2018/wordml" xmlns:w16du="http://schemas.microsoft.com/office/word/2023/wordml/word16du" xmlns:w16sdtdh="http://schemas.microsoft.com/office/word/2020/wordml/sdtdatahash" xmlns:w16sdtfl="http://schemas.microsoft.com/office/word/2024/wordml/sdtformatlock" xmlns:w16se="http://schemas.microsoft.com/office/word/2015/wordml/symex" xmlns:wpg="http://schemas.microsoft.com/office/word/2010/wordprocessingGroup" xmlns:wpi="http://schemas.microsoft.com/office/word/2010/wordprocessingInk" xmlns:wne="http://schemas.microsoft.com/office/word/2006/wordml" xmlns:wps="http://schemas.microsoft.com/office/word/2010/wordprocessingShape" mc:Ignorable="w14 w15 w16se w16cid w16 w16cex w16sdtdh w16sdtfl w16du wp14">
   <w:endnote w:type="separator" w:id="-1">
     <w:p>
       <w:pPr>
@@ -22776,7 +22800,7 @@
 </file>
 
 <file path=word/footer1.xml><?xml version="1.0" encoding="utf-8"?>
-<w:ftr xmlns:wpc="http://schemas.microsoft.com/office/word/2010/wordprocessingCanvas" xmlns:cx="http://schemas.microsoft.com/office/drawing/2014/chartex" xmlns:cx1="http://schemas.microsoft.com/office/drawing/2015/9/8/chartex" xmlns:cx2="http://schemas.microsoft.com/office/drawing/2015/10/21/chartex" xmlns:cx3="http://schemas.microsoft.com/office/drawing/2016/5/9/chartex" xmlns:cx4="http://schemas.microsoft.com/office/drawing/2016/5/10/chartex" xmlns:cx5="http://schemas.microsoft.com/office/drawing/2016/5/11/chartex" xmlns:cx6="http://schemas.microsoft.com/office/drawing/2016/5/12/chartex" xmlns:cx7="http://schemas.microsoft.com/office/drawing/2016/5/13/chartex" xmlns:cx8="http://schemas.microsoft.com/office/drawing/2016/5/14/chartex" xmlns:mc="http://schemas.openxmlformats.org/markup-compatibility/2006" xmlns:aink="http://schemas.microsoft.com/office/drawing/2016/ink" xmlns:am3d="http://schemas.microsoft.com/office/drawing/2017/model3d" xmlns:o="urn:schemas-microsoft-com:office:office" xmlns:oel="http://schemas.microsoft.com/office/2019/extlst" xmlns:r="http://schemas.openxmlformats.org/officeDocument/2006/relationships" xmlns:m="http://schemas.openxmlformats.org/officeDocument/2006/math" xmlns:v="urn:schemas-microsoft-com:vml" xmlns:wp14="http://schemas.microsoft.com/office/word/2010/wordprocessingDrawing" xmlns:wp="http://schemas.openxmlformats.org/drawingml/2006/wordprocessingDrawing" xmlns:w10="urn:schemas-microsoft-com:office:word" xmlns:w="http://schemas.openxmlformats.org/wordprocessingml/2006/main" xmlns:w14="http://schemas.microsoft.com/office/word/2010/wordml" xmlns:w15="http://schemas.microsoft.com/office/word/2012/wordml" xmlns:w16cex="http://schemas.microsoft.com/office/word/2018/wordml/cex" xmlns:w16cid="http://schemas.microsoft.com/office/word/2016/wordml/cid" xmlns:w16="http://schemas.microsoft.com/office/word/2018/wordml" xmlns:w16du="http://schemas.microsoft.com/office/word/2023/wordml/word16du" xmlns:w16sdtdh="http://schemas.microsoft.com/office/word/2020/wordml/sdtdatahash" xmlns:w16sdtfl="http://schemas.microsoft.com/office/word/2024/wordml/sdtformatlock" xmlns:w16se="http://schemas.microsoft.com/office/word/2015/wordml/symex" xmlns:wpg="http://schemas.microsoft.com/office/word/2010/wordprocessingGroup" xmlns:wpi="http://schemas.microsoft.com/office/word/2010/wordprocessingInk" xmlns:wne="http://schemas.microsoft.com/office/word/2006/wordml" xmlns:wps="http://schemas.microsoft.com/office/word/2010/wordprocessingShape" mc:Ignorable="w14 w15 w16se w16cid w16 w16cex w16sdtdh w16sdtfl w16du wp14">
+<w:ftr xmlns:wpc="http://schemas.microsoft.com/office/word/2010/wordprocessingCanvas" xmlns:cx="http://schemas.microsoft.com/office/drawing/2014/chartex" xmlns:cx1="http://schemas.microsoft.com/office/drawing/2015/9/8/chartex" xmlns:cx2="http://schemas.microsoft.com/office/drawing/2015/10/21/chartex" xmlns:cx3="http://schemas.microsoft.com/office/drawing/2016/5/9/chartex" xmlns:cx4="http://schemas.microsoft.com/office/drawing/2016/5/10/chartex" xmlns:cx5="http://schemas.microsoft.com/office/drawing/2016/5/11/chartex" xmlns:cx6="http://schemas.microsoft.com/office/drawing/2016/5/12/chartex" xmlns:cx7="http://schemas.microsoft.com/office/drawing/2016/5/13/chartex" xmlns:cx8="http://schemas.microsoft.com/office/drawing/2016/5/14/chartex" xmlns:mc="http://schemas.openxmlformats.org/markup-compatibility/2006" xmlns:aink="http://schemas.microsoft.com/office/drawing/2016/ink" xmlns:am3d="http://schemas.microsoft.com/office/drawing/2017/model3d" xmlns:o="urn:schemas-microsoft-com:office:office" xmlns:oel="http://schemas.microsoft.com/office/2019/extlst" xmlns:r="http://schemas.openxmlformats.org/officeDocument/2006/relationships" xmlns:m="http://schemas.openxmlformats.org/officeDocument/2006/math" xmlns:v="urn:schemas-microsoft-com:vml" xmlns:wp14="http://schemas.microsoft.com/office/word/2010/wordprocessingDrawing" xmlns:wp="http://schemas.openxmlformats.org/drawingml/2006/wordprocessingDrawing" xmlns:w10="urn:schemas-microsoft-com:office:word" xmlns:w="http://schemas.openxmlformats.org/wordprocessingml/2006/main" xmlns:w14="http://schemas.microsoft.com/office/word/2010/wordml" xmlns:w15="http://schemas.microsoft.com/office/word/2012/wordml" xmlns:w16cei="http://schemas.microsoft.com/office/word/2026/wordml/cei" xmlns:w16cex="http://schemas.microsoft.com/office/word/2018/wordml/cex" xmlns:w16cid="http://schemas.microsoft.com/office/word/2016/wordml/cid" xmlns:w16="http://schemas.microsoft.com/office/word/2018/wordml" xmlns:w16du="http://schemas.microsoft.com/office/word/2023/wordml/word16du" xmlns:w16sdtdh="http://schemas.microsoft.com/office/word/2020/wordml/sdtdatahash" xmlns:w16sdtfl="http://schemas.microsoft.com/office/word/2024/wordml/sdtformatlock" xmlns:w16se="http://schemas.microsoft.com/office/word/2015/wordml/symex" xmlns:wpg="http://schemas.microsoft.com/office/word/2010/wordprocessingGroup" xmlns:wpi="http://schemas.microsoft.com/office/word/2010/wordprocessingInk" xmlns:wne="http://schemas.microsoft.com/office/word/2006/wordml" xmlns:wps="http://schemas.microsoft.com/office/word/2010/wordprocessingShape" mc:Ignorable="w14 w15 w16se w16cid w16 w16cex w16sdtdh w16sdtfl w16du wp14">
   <w:p>
     <w:pPr>
       <w:pStyle w:val="Footer"/>
@@ -22923,7 +22947,7 @@
 </file>
 
 <file path=word/footer2.xml><?xml version="1.0" encoding="utf-8"?>
-<w:ftr xmlns:wpc="http://schemas.microsoft.com/office/word/2010/wordprocessingCanvas" xmlns:cx="http://schemas.microsoft.com/office/drawing/2014/chartex" xmlns:cx1="http://schemas.microsoft.com/office/drawing/2015/9/8/chartex" xmlns:cx2="http://schemas.microsoft.com/office/drawing/2015/10/21/chartex" xmlns:cx3="http://schemas.microsoft.com/office/drawing/2016/5/9/chartex" xmlns:cx4="http://schemas.microsoft.com/office/drawing/2016/5/10/chartex" xmlns:cx5="http://schemas.microsoft.com/office/drawing/2016/5/11/chartex" xmlns:cx6="http://schemas.microsoft.com/office/drawing/2016/5/12/chartex" xmlns:cx7="http://schemas.microsoft.com/office/drawing/2016/5/13/chartex" xmlns:cx8="http://schemas.microsoft.com/office/drawing/2016/5/14/chartex" xmlns:mc="http://schemas.openxmlformats.org/markup-compatibility/2006" xmlns:aink="http://schemas.microsoft.com/office/drawing/2016/ink" xmlns:am3d="http://schemas.microsoft.com/office/drawing/2017/model3d" xmlns:o="urn:schemas-microsoft-com:office:office" xmlns:oel="http://schemas.microsoft.com/office/2019/extlst" xmlns:r="http://schemas.openxmlformats.org/officeDocument/2006/relationships" xmlns:m="http://schemas.openxmlformats.org/officeDocument/2006/math" xmlns:v="urn:schemas-microsoft-com:vml" xmlns:wp14="http://schemas.microsoft.com/office/word/2010/wordprocessingDrawing" xmlns:wp="http://schemas.openxmlformats.org/drawingml/2006/wordprocessingDrawing" xmlns:w10="urn:schemas-microsoft-com:office:word" xmlns:w="http://schemas.openxmlformats.org/wordprocessingml/2006/main" xmlns:w14="http://schemas.microsoft.com/office/word/2010/wordml" xmlns:w15="http://schemas.microsoft.com/office/word/2012/wordml" xmlns:w16cex="http://schemas.microsoft.com/office/word/2018/wordml/cex" xmlns:w16cid="http://schemas.microsoft.com/office/word/2016/wordml/cid" xmlns:w16="http://schemas.microsoft.com/office/word/2018/wordml" xmlns:w16du="http://schemas.microsoft.com/office/word/2023/wordml/word16du" xmlns:w16sdtdh="http://schemas.microsoft.com/office/word/2020/wordml/sdtdatahash" xmlns:w16sdtfl="http://schemas.microsoft.com/office/word/2024/wordml/sdtformatlock" xmlns:w16se="http://schemas.microsoft.com/office/word/2015/wordml/symex" xmlns:wpg="http://schemas.microsoft.com/office/word/2010/wordprocessingGroup" xmlns:wpi="http://schemas.microsoft.com/office/word/2010/wordprocessingInk" xmlns:wne="http://schemas.microsoft.com/office/word/2006/wordml" xmlns:wps="http://schemas.microsoft.com/office/word/2010/wordprocessingShape" mc:Ignorable="w14 w15 w16se w16cid w16 w16cex w16sdtdh w16sdtfl w16du wp14">
+<w:ftr xmlns:wpc="http://schemas.microsoft.com/office/word/2010/wordprocessingCanvas" xmlns:cx="http://schemas.microsoft.com/office/drawing/2014/chartex" xmlns:cx1="http://schemas.microsoft.com/office/drawing/2015/9/8/chartex" xmlns:cx2="http://schemas.microsoft.com/office/drawing/2015/10/21/chartex" xmlns:cx3="http://schemas.microsoft.com/office/drawing/2016/5/9/chartex" xmlns:cx4="http://schemas.microsoft.com/office/drawing/2016/5/10/chartex" xmlns:cx5="http://schemas.microsoft.com/office/drawing/2016/5/11/chartex" xmlns:cx6="http://schemas.microsoft.com/office/drawing/2016/5/12/chartex" xmlns:cx7="http://schemas.microsoft.com/office/drawing/2016/5/13/chartex" xmlns:cx8="http://schemas.microsoft.com/office/drawing/2016/5/14/chartex" xmlns:mc="http://schemas.openxmlformats.org/markup-compatibility/2006" xmlns:aink="http://schemas.microsoft.com/office/drawing/2016/ink" xmlns:am3d="http://schemas.microsoft.com/office/drawing/2017/model3d" xmlns:o="urn:schemas-microsoft-com:office:office" xmlns:oel="http://schemas.microsoft.com/office/2019/extlst" xmlns:r="http://schemas.openxmlformats.org/officeDocument/2006/relationships" xmlns:m="http://schemas.openxmlformats.org/officeDocument/2006/math" xmlns:v="urn:schemas-microsoft-com:vml" xmlns:wp14="http://schemas.microsoft.com/office/word/2010/wordprocessingDrawing" xmlns:wp="http://schemas.openxmlformats.org/drawingml/2006/wordprocessingDrawing" xmlns:w10="urn:schemas-microsoft-com:office:word" xmlns:w="http://schemas.openxmlformats.org/wordprocessingml/2006/main" xmlns:w14="http://schemas.microsoft.com/office/word/2010/wordml" xmlns:w15="http://schemas.microsoft.com/office/word/2012/wordml" xmlns:w16cei="http://schemas.microsoft.com/office/word/2026/wordml/cei" xmlns:w16cex="http://schemas.microsoft.com/office/word/2018/wordml/cex" xmlns:w16cid="http://schemas.microsoft.com/office/word/2016/wordml/cid" xmlns:w16="http://schemas.microsoft.com/office/word/2018/wordml" xmlns:w16du="http://schemas.microsoft.com/office/word/2023/wordml/word16du" xmlns:w16sdtdh="http://schemas.microsoft.com/office/word/2020/wordml/sdtdatahash" xmlns:w16sdtfl="http://schemas.microsoft.com/office/word/2024/wordml/sdtformatlock" xmlns:w16se="http://schemas.microsoft.com/office/word/2015/wordml/symex" xmlns:wpg="http://schemas.microsoft.com/office/word/2010/wordprocessingGroup" xmlns:wpi="http://schemas.microsoft.com/office/word/2010/wordprocessingInk" xmlns:wne="http://schemas.microsoft.com/office/word/2006/wordml" xmlns:wps="http://schemas.microsoft.com/office/word/2010/wordprocessingShape" mc:Ignorable="w14 w15 w16se w16cid w16 w16cex w16sdtdh w16sdtfl w16du wp14">
   <w:p>
     <w:pPr>
       <w:pBdr>
@@ -23133,7 +23157,7 @@
 </file>
 
 <file path=word/footnotes.xml><?xml version="1.0" encoding="utf-8"?>
-<w:footnotes xmlns:wpc="http://schemas.microsoft.com/office/word/2010/wordprocessingCanvas" xmlns:cx="http://schemas.microsoft.com/office/drawing/2014/chartex" xmlns:cx1="http://schemas.microsoft.com/office/drawing/2015/9/8/chartex" xmlns:cx2="http://schemas.microsoft.com/office/drawing/2015/10/21/chartex" xmlns:cx3="http://schemas.microsoft.com/office/drawing/2016/5/9/chartex" xmlns:cx4="http://schemas.microsoft.com/office/drawing/2016/5/10/chartex" xmlns:cx5="http://schemas.microsoft.com/office/drawing/2016/5/11/chartex" xmlns:cx6="http://schemas.microsoft.com/office/drawing/2016/5/12/chartex" xmlns:cx7="http://schemas.microsoft.com/office/drawing/2016/5/13/chartex" xmlns:cx8="http://schemas.microsoft.com/office/drawing/2016/5/14/chartex" xmlns:mc="http://schemas.openxmlformats.org/markup-compatibility/2006" xmlns:aink="http://schemas.microsoft.com/office/drawing/2016/ink" xmlns:am3d="http://schemas.microsoft.com/office/drawing/2017/model3d" xmlns:o="urn:schemas-microsoft-com:office:office" xmlns:oel="http://schemas.microsoft.com/office/2019/extlst" xmlns:r="http://schemas.openxmlformats.org/officeDocument/2006/relationships" xmlns:m="http://schemas.openxmlformats.org/officeDocument/2006/math" xmlns:v="urn:schemas-microsoft-com:vml" xmlns:wp14="http://schemas.microsoft.com/office/word/2010/wordprocessingDrawing" xmlns:wp="http://schemas.openxmlformats.org/drawingml/2006/wordprocessingDrawing" xmlns:w10="urn:schemas-microsoft-com:office:word" xmlns:w="http://schemas.openxmlformats.org/wordprocessingml/2006/main" xmlns:w14="http://schemas.microsoft.com/office/word/2010/wordml" xmlns:w15="http://schemas.microsoft.com/office/word/2012/wordml" xmlns:w16cex="http://schemas.microsoft.com/office/word/2018/wordml/cex" xmlns:w16cid="http://schemas.microsoft.com/office/word/2016/wordml/cid" xmlns:w16="http://schemas.microsoft.com/office/word/2018/wordml" xmlns:w16du="http://schemas.microsoft.com/office/word/2023/wordml/word16du" xmlns:w16sdtdh="http://schemas.microsoft.com/office/word/2020/wordml/sdtdatahash" xmlns:w16sdtfl="http://schemas.microsoft.com/office/word/2024/wordml/sdtformatlock" xmlns:w16se="http://schemas.microsoft.com/office/word/2015/wordml/symex" xmlns:wpg="http://schemas.microsoft.com/office/word/2010/wordprocessingGroup" xmlns:wpi="http://schemas.microsoft.com/office/word/2010/wordprocessingInk" xmlns:wne="http://schemas.microsoft.com/office/word/2006/wordml" xmlns:wps="http://schemas.microsoft.com/office/word/2010/wordprocessingShape" mc:Ignorable="w14 w15 w16se w16cid w16 w16cex w16sdtdh w16sdtfl w16du wp14">
+<w:footnotes xmlns:wpc="http://schemas.microsoft.com/office/word/2010/wordprocessingCanvas" xmlns:cx="http://schemas.microsoft.com/office/drawing/2014/chartex" xmlns:cx1="http://schemas.microsoft.com/office/drawing/2015/9/8/chartex" xmlns:cx2="http://schemas.microsoft.com/office/drawing/2015/10/21/chartex" xmlns:cx3="http://schemas.microsoft.com/office/drawing/2016/5/9/chartex" xmlns:cx4="http://schemas.microsoft.com/office/drawing/2016/5/10/chartex" xmlns:cx5="http://schemas.microsoft.com/office/drawing/2016/5/11/chartex" xmlns:cx6="http://schemas.microsoft.com/office/drawing/2016/5/12/chartex" xmlns:cx7="http://schemas.microsoft.com/office/drawing/2016/5/13/chartex" xmlns:cx8="http://schemas.microsoft.com/office/drawing/2016/5/14/chartex" xmlns:mc="http://schemas.openxmlformats.org/markup-compatibility/2006" xmlns:aink="http://schemas.microsoft.com/office/drawing/2016/ink" xmlns:am3d="http://schemas.microsoft.com/office/drawing/2017/model3d" xmlns:o="urn:schemas-microsoft-com:office:office" xmlns:oel="http://schemas.microsoft.com/office/2019/extlst" xmlns:r="http://schemas.openxmlformats.org/officeDocument/2006/relationships" xmlns:m="http://schemas.openxmlformats.org/officeDocument/2006/math" xmlns:v="urn:schemas-microsoft-com:vml" xmlns:wp14="http://schemas.microsoft.com/office/word/2010/wordprocessingDrawing" xmlns:wp="http://schemas.openxmlformats.org/drawingml/2006/wordprocessingDrawing" xmlns:w10="urn:schemas-microsoft-com:office:word" xmlns:w="http://schemas.openxmlformats.org/wordprocessingml/2006/main" xmlns:w14="http://schemas.microsoft.com/office/word/2010/wordml" xmlns:w15="http://schemas.microsoft.com/office/word/2012/wordml" xmlns:w16cei="http://schemas.microsoft.com/office/word/2026/wordml/cei" xmlns:w16cex="http://schemas.microsoft.com/office/word/2018/wordml/cex" xmlns:w16cid="http://schemas.microsoft.com/office/word/2016/wordml/cid" xmlns:w16="http://schemas.microsoft.com/office/word/2018/wordml" xmlns:w16du="http://schemas.microsoft.com/office/word/2023/wordml/word16du" xmlns:w16sdtdh="http://schemas.microsoft.com/office/word/2020/wordml/sdtdatahash" xmlns:w16sdtfl="http://schemas.microsoft.com/office/word/2024/wordml/sdtformatlock" xmlns:w16se="http://schemas.microsoft.com/office/word/2015/wordml/symex" xmlns:wpg="http://schemas.microsoft.com/office/word/2010/wordprocessingGroup" xmlns:wpi="http://schemas.microsoft.com/office/word/2010/wordprocessingInk" xmlns:wne="http://schemas.microsoft.com/office/word/2006/wordml" xmlns:wps="http://schemas.microsoft.com/office/word/2010/wordprocessingShape" mc:Ignorable="w14 w15 w16se w16cid w16 w16cex w16sdtdh w16sdtfl w16du wp14">
   <w:footnote w:type="separator" w:id="-1">
     <w:p>
       <w:pPr>
@@ -23158,7 +23182,7 @@
 </file>
 
 <file path=word/header1.xml><?xml version="1.0" encoding="utf-8"?>
-<w:hdr xmlns:wpc="http://schemas.microsoft.com/office/word/2010/wordprocessingCanvas" xmlns:cx="http://schemas.microsoft.com/office/drawing/2014/chartex" xmlns:cx1="http://schemas.microsoft.com/office/drawing/2015/9/8/chartex" xmlns:cx2="http://schemas.microsoft.com/office/drawing/2015/10/21/chartex" xmlns:cx3="http://schemas.microsoft.com/office/drawing/2016/5/9/chartex" xmlns:cx4="http://schemas.microsoft.com/office/drawing/2016/5/10/chartex" xmlns:cx5="http://schemas.microsoft.com/office/drawing/2016/5/11/chartex" xmlns:cx6="http://schemas.microsoft.com/office/drawing/2016/5/12/chartex" xmlns:cx7="http://schemas.microsoft.com/office/drawing/2016/5/13/chartex" xmlns:cx8="http://schemas.microsoft.com/office/drawing/2016/5/14/chartex" xmlns:mc="http://schemas.openxmlformats.org/markup-compatibility/2006" xmlns:aink="http://schemas.microsoft.com/office/drawing/2016/ink" xmlns:am3d="http://schemas.microsoft.com/office/drawing/2017/model3d" xmlns:o="urn:schemas-microsoft-com:office:office" xmlns:oel="http://schemas.microsoft.com/office/2019/extlst" xmlns:r="http://schemas.openxmlformats.org/officeDocument/2006/relationships" xmlns:m="http://schemas.openxmlformats.org/officeDocument/2006/math" xmlns:v="urn:schemas-microsoft-com:vml" xmlns:wp14="http://schemas.microsoft.com/office/word/2010/wordprocessingDrawing" xmlns:wp="http://schemas.openxmlformats.org/drawingml/2006/wordprocessingDrawing" xmlns:w10="urn:schemas-microsoft-com:office:word" xmlns:w="http://schemas.openxmlformats.org/wordprocessingml/2006/main" xmlns:w14="http://schemas.microsoft.com/office/word/2010/wordml" xmlns:w15="http://schemas.microsoft.com/office/word/2012/wordml" xmlns:w16cex="http://schemas.microsoft.com/office/word/2018/wordml/cex" xmlns:w16cid="http://schemas.microsoft.com/office/word/2016/wordml/cid" xmlns:w16="http://schemas.microsoft.com/office/word/2018/wordml" xmlns:w16du="http://schemas.microsoft.com/office/word/2023/wordml/word16du" xmlns:w16sdtdh="http://schemas.microsoft.com/office/word/2020/wordml/sdtdatahash" xmlns:w16sdtfl="http://schemas.microsoft.com/office/word/2024/wordml/sdtformatlock" xmlns:w16se="http://schemas.microsoft.com/office/word/2015/wordml/symex" xmlns:wpg="http://schemas.microsoft.com/office/word/2010/wordprocessingGroup" xmlns:wpi="http://schemas.microsoft.com/office/word/2010/wordprocessingInk" xmlns:wne="http://schemas.microsoft.com/office/word/2006/wordml" xmlns:wps="http://schemas.microsoft.com/office/word/2010/wordprocessingShape" mc:Ignorable="w14 w15 w16se w16cid w16 w16cex w16sdtdh w16sdtfl w16du wp14">
+<w:hdr xmlns:wpc="http://schemas.microsoft.com/office/word/2010/wordprocessingCanvas" xmlns:cx="http://schemas.microsoft.com/office/drawing/2014/chartex" xmlns:cx1="http://schemas.microsoft.com/office/drawing/2015/9/8/chartex" xmlns:cx2="http://schemas.microsoft.com/office/drawing/2015/10/21/chartex" xmlns:cx3="http://schemas.microsoft.com/office/drawing/2016/5/9/chartex" xmlns:cx4="http://schemas.microsoft.com/office/drawing/2016/5/10/chartex" xmlns:cx5="http://schemas.microsoft.com/office/drawing/2016/5/11/chartex" xmlns:cx6="http://schemas.microsoft.com/office/drawing/2016/5/12/chartex" xmlns:cx7="http://schemas.microsoft.com/office/drawing/2016/5/13/chartex" xmlns:cx8="http://schemas.microsoft.com/office/drawing/2016/5/14/chartex" xmlns:mc="http://schemas.openxmlformats.org/markup-compatibility/2006" xmlns:aink="http://schemas.microsoft.com/office/drawing/2016/ink" xmlns:am3d="http://schemas.microsoft.com/office/drawing/2017/model3d" xmlns:o="urn:schemas-microsoft-com:office:office" xmlns:oel="http://schemas.microsoft.com/office/2019/extlst" xmlns:r="http://schemas.openxmlformats.org/officeDocument/2006/relationships" xmlns:m="http://schemas.openxmlformats.org/officeDocument/2006/math" xmlns:v="urn:schemas-microsoft-com:vml" xmlns:wp14="http://schemas.microsoft.com/office/word/2010/wordprocessingDrawing" xmlns:wp="http://schemas.openxmlformats.org/drawingml/2006/wordprocessingDrawing" xmlns:w10="urn:schemas-microsoft-com:office:word" xmlns:w="http://schemas.openxmlformats.org/wordprocessingml/2006/main" xmlns:w14="http://schemas.microsoft.com/office/word/2010/wordml" xmlns:w15="http://schemas.microsoft.com/office/word/2012/wordml" xmlns:w16cei="http://schemas.microsoft.com/office/word/2026/wordml/cei" xmlns:w16cex="http://schemas.microsoft.com/office/word/2018/wordml/cex" xmlns:w16cid="http://schemas.microsoft.com/office/word/2016/wordml/cid" xmlns:w16="http://schemas.microsoft.com/office/word/2018/wordml" xmlns:w16du="http://schemas.microsoft.com/office/word/2023/wordml/word16du" xmlns:w16sdtdh="http://schemas.microsoft.com/office/word/2020/wordml/sdtdatahash" xmlns:w16sdtfl="http://schemas.microsoft.com/office/word/2024/wordml/sdtformatlock" xmlns:w16se="http://schemas.microsoft.com/office/word/2015/wordml/symex" xmlns:wpg="http://schemas.microsoft.com/office/word/2010/wordprocessingGroup" xmlns:wpi="http://schemas.microsoft.com/office/word/2010/wordprocessingInk" xmlns:wne="http://schemas.microsoft.com/office/word/2006/wordml" xmlns:wps="http://schemas.microsoft.com/office/word/2010/wordprocessingShape" mc:Ignorable="w14 w15 w16se w16cid w16 w16cex w16sdtdh w16sdtfl w16du wp14">
   <w:p>
     <w:pPr>
       <w:pStyle w:val="Header"/>
@@ -23171,7 +23195,7 @@
 </file>
 
 <file path=word/header2.xml><?xml version="1.0" encoding="utf-8"?>
-<w:hdr xmlns:wpc="http://schemas.microsoft.com/office/word/2010/wordprocessingCanvas" xmlns:cx="http://schemas.microsoft.com/office/drawing/2014/chartex" xmlns:cx1="http://schemas.microsoft.com/office/drawing/2015/9/8/chartex" xmlns:cx2="http://schemas.microsoft.com/office/drawing/2015/10/21/chartex" xmlns:cx3="http://schemas.microsoft.com/office/drawing/2016/5/9/chartex" xmlns:cx4="http://schemas.microsoft.com/office/drawing/2016/5/10/chartex" xmlns:cx5="http://schemas.microsoft.com/office/drawing/2016/5/11/chartex" xmlns:cx6="http://schemas.microsoft.com/office/drawing/2016/5/12/chartex" xmlns:cx7="http://schemas.microsoft.com/office/drawing/2016/5/13/chartex" xmlns:cx8="http://schemas.microsoft.com/office/drawing/2016/5/14/chartex" xmlns:mc="http://schemas.openxmlformats.org/markup-compatibility/2006" xmlns:aink="http://schemas.microsoft.com/office/drawing/2016/ink" xmlns:am3d="http://schemas.microsoft.com/office/drawing/2017/model3d" xmlns:o="urn:schemas-microsoft-com:office:office" xmlns:oel="http://schemas.microsoft.com/office/2019/extlst" xmlns:r="http://schemas.openxmlformats.org/officeDocument/2006/relationships" xmlns:m="http://schemas.openxmlformats.org/officeDocument/2006/math" xmlns:v="urn:schemas-microsoft-com:vml" xmlns:wp14="http://schemas.microsoft.com/office/word/2010/wordprocessingDrawing" xmlns:wp="http://schemas.openxmlformats.org/drawingml/2006/wordprocessingDrawing" xmlns:w10="urn:schemas-microsoft-com:office:word" xmlns:w="http://schemas.openxmlformats.org/wordprocessingml/2006/main" xmlns:w14="http://schemas.microsoft.com/office/word/2010/wordml" xmlns:w15="http://schemas.microsoft.com/office/word/2012/wordml" xmlns:w16cex="http://schemas.microsoft.com/office/word/2018/wordml/cex" xmlns:w16cid="http://schemas.microsoft.com/office/word/2016/wordml/cid" xmlns:w16="http://schemas.microsoft.com/office/word/2018/wordml" xmlns:w16du="http://schemas.microsoft.com/office/word/2023/wordml/word16du" xmlns:w16sdtdh="http://schemas.microsoft.com/office/word/2020/wordml/sdtdatahash" xmlns:w16sdtfl="http://schemas.microsoft.com/office/word/2024/wordml/sdtformatlock" xmlns:w16se="http://schemas.microsoft.com/office/word/2015/wordml/symex" xmlns:wpg="http://schemas.microsoft.com/office/word/2010/wordprocessingGroup" xmlns:wpi="http://schemas.microsoft.com/office/word/2010/wordprocessingInk" xmlns:wne="http://schemas.microsoft.com/office/word/2006/wordml" xmlns:wps="http://schemas.microsoft.com/office/word/2010/wordprocessingShape" mc:Ignorable="w14 w15 w16se w16cid w16 w16cex w16sdtdh w16sdtfl w16du wp14">
+<w:hdr xmlns:wpc="http://schemas.microsoft.com/office/word/2010/wordprocessingCanvas" xmlns:cx="http://schemas.microsoft.com/office/drawing/2014/chartex" xmlns:cx1="http://schemas.microsoft.com/office/drawing/2015/9/8/chartex" xmlns:cx2="http://schemas.microsoft.com/office/drawing/2015/10/21/chartex" xmlns:cx3="http://schemas.microsoft.com/office/drawing/2016/5/9/chartex" xmlns:cx4="http://schemas.microsoft.com/office/drawing/2016/5/10/chartex" xmlns:cx5="http://schemas.microsoft.com/office/drawing/2016/5/11/chartex" xmlns:cx6="http://schemas.microsoft.com/office/drawing/2016/5/12/chartex" xmlns:cx7="http://schemas.microsoft.com/office/drawing/2016/5/13/chartex" xmlns:cx8="http://schemas.microsoft.com/office/drawing/2016/5/14/chartex" xmlns:mc="http://schemas.openxmlformats.org/markup-compatibility/2006" xmlns:aink="http://schemas.microsoft.com/office/drawing/2016/ink" xmlns:am3d="http://schemas.microsoft.com/office/drawing/2017/model3d" xmlns:o="urn:schemas-microsoft-com:office:office" xmlns:oel="http://schemas.microsoft.com/office/2019/extlst" xmlns:r="http://schemas.openxmlformats.org/officeDocument/2006/relationships" xmlns:m="http://schemas.openxmlformats.org/officeDocument/2006/math" xmlns:v="urn:schemas-microsoft-com:vml" xmlns:wp14="http://schemas.microsoft.com/office/word/2010/wordprocessingDrawing" xmlns:wp="http://schemas.openxmlformats.org/drawingml/2006/wordprocessingDrawing" xmlns:w10="urn:schemas-microsoft-com:office:word" xmlns:w="http://schemas.openxmlformats.org/wordprocessingml/2006/main" xmlns:w14="http://schemas.microsoft.com/office/word/2010/wordml" xmlns:w15="http://schemas.microsoft.com/office/word/2012/wordml" xmlns:w16cei="http://schemas.microsoft.com/office/word/2026/wordml/cei" xmlns:w16cex="http://schemas.microsoft.com/office/word/2018/wordml/cex" xmlns:w16cid="http://schemas.microsoft.com/office/word/2016/wordml/cid" xmlns:w16="http://schemas.microsoft.com/office/word/2018/wordml" xmlns:w16du="http://schemas.microsoft.com/office/word/2023/wordml/word16du" xmlns:w16sdtdh="http://schemas.microsoft.com/office/word/2020/wordml/sdtdatahash" xmlns:w16sdtfl="http://schemas.microsoft.com/office/word/2024/wordml/sdtformatlock" xmlns:w16se="http://schemas.microsoft.com/office/word/2015/wordml/symex" xmlns:wpg="http://schemas.microsoft.com/office/word/2010/wordprocessingGroup" xmlns:wpi="http://schemas.microsoft.com/office/word/2010/wordprocessingInk" xmlns:wne="http://schemas.microsoft.com/office/word/2006/wordml" xmlns:wps="http://schemas.microsoft.com/office/word/2010/wordprocessingShape" mc:Ignorable="w14 w15 w16se w16cid w16 w16cex w16sdtdh w16sdtfl w16du wp14">
   <w:p>
     <w:pPr>
       <w:pStyle w:val="Header"/>

</xml_diff>